<commit_message>
Remove appendix F from business plan outputs
</commit_message>
<xml_diff>
--- a/output/word/businessplan_robert_anna_walter_bankversion.docx
+++ b/output/word/businessplan_robert_anna_walter_bankversion.docx
@@ -104,7 +104,7 @@
                 <w:b/>
                 <w:i w:val="0"/>
               </w:rPr>
-              <w:t>Gründer:innen</w:t>
+              <w:t>Gründer</w:t>
             </w:r>
           </w:p>
         </w:tc>
@@ -36423,502 +36423,6 @@
           <w:sz w:val="19"/>
         </w:rPr>
         <w:t>Kooperationspartner</w:t>
-      </w:r>
-    </w:p>
-    <w:p>
-      <w:pPr>
-        <w:pStyle w:val="Heading2"/>
-      </w:pPr>
-      <w:r>
-        <w:rPr>
-          <w:rFonts w:ascii="Arial" w:hAnsi="Arial" w:cs="Arial"/>
-          <w:b/>
-          <w:i w:val="0"/>
-        </w:rPr>
-        <w:t>Anhang F – Bankunterlagenliste</w:t>
-      </w:r>
-    </w:p>
-    <w:p>
-      <w:pPr>
-        <w:spacing w:before="0" w:after="140" w:line="293" w:lineRule="auto"/>
-        <w:jc w:val="both"/>
-      </w:pPr>
-      <w:r>
-        <w:rPr>
-          <w:rFonts w:ascii="Arial" w:hAnsi="Arial" w:cs="Arial"/>
-          <w:b w:val="0"/>
-          <w:i w:val="0"/>
-          <w:sz w:val="20"/>
-        </w:rPr>
-        <w:t>Für Bankgespräche sollten folgende Unterlagen vorbereitet werden:</w:t>
-      </w:r>
-    </w:p>
-    <w:p>
-      <w:pPr>
-        <w:numPr>
-          <w:ilvl w:val="0"/>
-          <w:numId w:val="10"/>
-        </w:numPr>
-        <w:spacing w:before="0" w:after="60" w:line="283" w:lineRule="auto"/>
-      </w:pPr>
-      <w:r>
-        <w:rPr>
-          <w:rFonts w:ascii="Arial" w:hAnsi="Arial" w:cs="Arial"/>
-          <w:b w:val="0"/>
-          <w:i w:val="0"/>
-          <w:sz w:val="19"/>
-        </w:rPr>
-        <w:t>Businessplan</w:t>
-      </w:r>
-    </w:p>
-    <w:p>
-      <w:pPr>
-        <w:numPr>
-          <w:ilvl w:val="0"/>
-          <w:numId w:val="10"/>
-        </w:numPr>
-        <w:spacing w:before="0" w:after="60" w:line="283" w:lineRule="auto"/>
-      </w:pPr>
-      <w:r>
-        <w:rPr>
-          <w:rFonts w:ascii="Arial" w:hAnsi="Arial" w:cs="Arial"/>
-          <w:b w:val="0"/>
-          <w:i w:val="0"/>
-          <w:sz w:val="19"/>
-        </w:rPr>
-        <w:t>Anhang zum Businessplan</w:t>
-      </w:r>
-    </w:p>
-    <w:p>
-      <w:pPr>
-        <w:numPr>
-          <w:ilvl w:val="0"/>
-          <w:numId w:val="10"/>
-        </w:numPr>
-        <w:spacing w:before="0" w:after="60" w:line="283" w:lineRule="auto"/>
-      </w:pPr>
-      <w:r>
-        <w:rPr>
-          <w:rFonts w:ascii="Arial" w:hAnsi="Arial" w:cs="Arial"/>
-          <w:b w:val="0"/>
-          <w:i w:val="0"/>
-          <w:sz w:val="19"/>
-        </w:rPr>
-        <w:t>Kreditübersicht</w:t>
-      </w:r>
-    </w:p>
-    <w:p>
-      <w:pPr>
-        <w:numPr>
-          <w:ilvl w:val="0"/>
-          <w:numId w:val="10"/>
-        </w:numPr>
-        <w:spacing w:before="0" w:after="60" w:line="283" w:lineRule="auto"/>
-      </w:pPr>
-      <w:r>
-        <w:rPr>
-          <w:rFonts w:ascii="Arial" w:hAnsi="Arial" w:cs="Arial"/>
-          <w:b w:val="0"/>
-          <w:i w:val="0"/>
-          <w:sz w:val="19"/>
-        </w:rPr>
-        <w:t>Einkommensnachweise</w:t>
-      </w:r>
-    </w:p>
-    <w:p>
-      <w:pPr>
-        <w:numPr>
-          <w:ilvl w:val="0"/>
-          <w:numId w:val="10"/>
-        </w:numPr>
-        <w:spacing w:before="0" w:after="60" w:line="283" w:lineRule="auto"/>
-      </w:pPr>
-      <w:r>
-        <w:rPr>
-          <w:rFonts w:ascii="Arial" w:hAnsi="Arial" w:cs="Arial"/>
-          <w:b w:val="0"/>
-          <w:i w:val="0"/>
-          <w:sz w:val="19"/>
-        </w:rPr>
-        <w:t>Nachweis über schwedischen Wohnsitz</w:t>
-      </w:r>
-    </w:p>
-    <w:p>
-      <w:pPr>
-        <w:numPr>
-          <w:ilvl w:val="0"/>
-          <w:numId w:val="10"/>
-        </w:numPr>
-        <w:spacing w:before="0" w:after="60" w:line="283" w:lineRule="auto"/>
-      </w:pPr>
-      <w:r>
-        <w:rPr>
-          <w:rFonts w:ascii="Arial" w:hAnsi="Arial" w:cs="Arial"/>
-          <w:b w:val="0"/>
-          <w:i w:val="0"/>
-          <w:sz w:val="19"/>
-        </w:rPr>
-        <w:t>Personnummern</w:t>
-      </w:r>
-    </w:p>
-    <w:p>
-      <w:pPr>
-        <w:numPr>
-          <w:ilvl w:val="0"/>
-          <w:numId w:val="10"/>
-        </w:numPr>
-        <w:spacing w:before="0" w:after="60" w:line="283" w:lineRule="auto"/>
-      </w:pPr>
-      <w:r>
-        <w:rPr>
-          <w:rFonts w:ascii="Arial" w:hAnsi="Arial" w:cs="Arial"/>
-          <w:b w:val="0"/>
-          <w:i w:val="0"/>
-          <w:sz w:val="19"/>
-        </w:rPr>
-        <w:t>Nachweise zu bestehenden Verpflichtungen</w:t>
-      </w:r>
-    </w:p>
-    <w:p>
-      <w:pPr>
-        <w:numPr>
-          <w:ilvl w:val="0"/>
-          <w:numId w:val="10"/>
-        </w:numPr>
-        <w:spacing w:before="0" w:after="60" w:line="283" w:lineRule="auto"/>
-      </w:pPr>
-      <w:r>
-        <w:rPr>
-          <w:rFonts w:ascii="Arial" w:hAnsi="Arial" w:cs="Arial"/>
-          <w:b w:val="0"/>
-          <w:i w:val="0"/>
-          <w:sz w:val="19"/>
-        </w:rPr>
-        <w:t>Grundstücksdaten</w:t>
-      </w:r>
-    </w:p>
-    <w:p>
-      <w:pPr>
-        <w:numPr>
-          <w:ilvl w:val="0"/>
-          <w:numId w:val="10"/>
-        </w:numPr>
-        <w:spacing w:before="0" w:after="60" w:line="283" w:lineRule="auto"/>
-      </w:pPr>
-      <w:r>
-        <w:rPr>
-          <w:rFonts w:ascii="Arial" w:hAnsi="Arial" w:cs="Arial"/>
-          <w:b w:val="0"/>
-          <w:i w:val="0"/>
-          <w:sz w:val="19"/>
-        </w:rPr>
-        <w:t>Kaufunterlagen</w:t>
-      </w:r>
-    </w:p>
-    <w:p>
-      <w:pPr>
-        <w:numPr>
-          <w:ilvl w:val="0"/>
-          <w:numId w:val="10"/>
-        </w:numPr>
-        <w:spacing w:before="0" w:after="60" w:line="283" w:lineRule="auto"/>
-      </w:pPr>
-      <w:r>
-        <w:rPr>
-          <w:rFonts w:ascii="Arial" w:hAnsi="Arial" w:cs="Arial"/>
-          <w:b w:val="0"/>
-          <w:i w:val="0"/>
-          <w:sz w:val="19"/>
-        </w:rPr>
-        <w:t>Inserat / Objektbeschreibung</w:t>
-      </w:r>
-    </w:p>
-    <w:p>
-      <w:pPr>
-        <w:numPr>
-          <w:ilvl w:val="0"/>
-          <w:numId w:val="10"/>
-        </w:numPr>
-        <w:spacing w:before="0" w:after="60" w:line="283" w:lineRule="auto"/>
-      </w:pPr>
-      <w:r>
-        <w:rPr>
-          <w:rFonts w:ascii="Arial" w:hAnsi="Arial" w:cs="Arial"/>
-          <w:b w:val="0"/>
-          <w:i w:val="0"/>
-          <w:sz w:val="19"/>
-        </w:rPr>
-        <w:t>Fotos der Immobilie</w:t>
-      </w:r>
-    </w:p>
-    <w:p>
-      <w:pPr>
-        <w:numPr>
-          <w:ilvl w:val="0"/>
-          <w:numId w:val="10"/>
-        </w:numPr>
-        <w:spacing w:before="0" w:after="60" w:line="283" w:lineRule="auto"/>
-      </w:pPr>
-      <w:r>
-        <w:rPr>
-          <w:rFonts w:ascii="Arial" w:hAnsi="Arial" w:cs="Arial"/>
-          <w:b w:val="0"/>
-          <w:i w:val="0"/>
-          <w:sz w:val="19"/>
-        </w:rPr>
-        <w:t>Kostenschätzungen Brunnen</w:t>
-      </w:r>
-    </w:p>
-    <w:p>
-      <w:pPr>
-        <w:numPr>
-          <w:ilvl w:val="0"/>
-          <w:numId w:val="10"/>
-        </w:numPr>
-        <w:spacing w:before="0" w:after="60" w:line="283" w:lineRule="auto"/>
-      </w:pPr>
-      <w:r>
-        <w:rPr>
-          <w:rFonts w:ascii="Arial" w:hAnsi="Arial" w:cs="Arial"/>
-          <w:b w:val="0"/>
-          <w:i w:val="0"/>
-          <w:sz w:val="19"/>
-        </w:rPr>
-        <w:t>Kostenschätzungen Abwasser</w:t>
-      </w:r>
-    </w:p>
-    <w:p>
-      <w:pPr>
-        <w:numPr>
-          <w:ilvl w:val="0"/>
-          <w:numId w:val="10"/>
-        </w:numPr>
-        <w:spacing w:before="0" w:after="60" w:line="283" w:lineRule="auto"/>
-      </w:pPr>
-      <w:r>
-        <w:rPr>
-          <w:rFonts w:ascii="Arial" w:hAnsi="Arial" w:cs="Arial"/>
-          <w:b w:val="0"/>
-          <w:i w:val="0"/>
-          <w:sz w:val="19"/>
-        </w:rPr>
-        <w:t>Kostenschätzungen Elektrik</w:t>
-      </w:r>
-    </w:p>
-    <w:p>
-      <w:pPr>
-        <w:numPr>
-          <w:ilvl w:val="0"/>
-          <w:numId w:val="10"/>
-        </w:numPr>
-        <w:spacing w:before="0" w:after="60" w:line="283" w:lineRule="auto"/>
-      </w:pPr>
-      <w:r>
-        <w:rPr>
-          <w:rFonts w:ascii="Arial" w:hAnsi="Arial" w:cs="Arial"/>
-          <w:b w:val="0"/>
-          <w:i w:val="0"/>
-          <w:sz w:val="19"/>
-        </w:rPr>
-        <w:t>Kostenschätzungen Sanitär</w:t>
-      </w:r>
-    </w:p>
-    <w:p>
-      <w:pPr>
-        <w:numPr>
-          <w:ilvl w:val="0"/>
-          <w:numId w:val="10"/>
-        </w:numPr>
-        <w:spacing w:before="0" w:after="60" w:line="283" w:lineRule="auto"/>
-      </w:pPr>
-      <w:r>
-        <w:rPr>
-          <w:rFonts w:ascii="Arial" w:hAnsi="Arial" w:cs="Arial"/>
-          <w:b w:val="0"/>
-          <w:i w:val="0"/>
-          <w:sz w:val="19"/>
-        </w:rPr>
-        <w:t>Investitionsplan</w:t>
-      </w:r>
-    </w:p>
-    <w:p>
-      <w:pPr>
-        <w:numPr>
-          <w:ilvl w:val="0"/>
-          <w:numId w:val="10"/>
-        </w:numPr>
-        <w:spacing w:before="0" w:after="60" w:line="283" w:lineRule="auto"/>
-      </w:pPr>
-      <w:r>
-        <w:rPr>
-          <w:rFonts w:ascii="Arial" w:hAnsi="Arial" w:cs="Arial"/>
-          <w:b w:val="0"/>
-          <w:i w:val="0"/>
-          <w:sz w:val="19"/>
-        </w:rPr>
-        <w:t>Zeitplan</w:t>
-      </w:r>
-    </w:p>
-    <w:p>
-      <w:pPr>
-        <w:numPr>
-          <w:ilvl w:val="0"/>
-          <w:numId w:val="10"/>
-        </w:numPr>
-        <w:spacing w:before="0" w:after="60" w:line="283" w:lineRule="auto"/>
-      </w:pPr>
-      <w:r>
-        <w:rPr>
-          <w:rFonts w:ascii="Arial" w:hAnsi="Arial" w:cs="Arial"/>
-          <w:b w:val="0"/>
-          <w:i w:val="0"/>
-          <w:sz w:val="19"/>
-        </w:rPr>
-        <w:t>Versicherungsübersicht</w:t>
-      </w:r>
-    </w:p>
-    <w:p>
-      <w:pPr>
-        <w:numPr>
-          <w:ilvl w:val="0"/>
-          <w:numId w:val="10"/>
-        </w:numPr>
-        <w:spacing w:before="0" w:after="60" w:line="283" w:lineRule="auto"/>
-      </w:pPr>
-      <w:r>
-        <w:rPr>
-          <w:rFonts w:ascii="Arial" w:hAnsi="Arial" w:cs="Arial"/>
-          <w:b w:val="0"/>
-          <w:i w:val="0"/>
-          <w:sz w:val="19"/>
-        </w:rPr>
-        <w:t>Nachweise über Eigenleistung</w:t>
-      </w:r>
-    </w:p>
-    <w:p>
-      <w:pPr>
-        <w:numPr>
-          <w:ilvl w:val="0"/>
-          <w:numId w:val="10"/>
-        </w:numPr>
-        <w:spacing w:before="0" w:after="60" w:line="283" w:lineRule="auto"/>
-      </w:pPr>
-      <w:r>
-        <w:rPr>
-          <w:rFonts w:ascii="Arial" w:hAnsi="Arial" w:cs="Arial"/>
-          <w:b w:val="0"/>
-          <w:i w:val="0"/>
-          <w:sz w:val="19"/>
-        </w:rPr>
-        <w:t>Referenzbilder handwerklicher Arbeiten</w:t>
-      </w:r>
-    </w:p>
-    <w:p>
-      <w:pPr>
-        <w:numPr>
-          <w:ilvl w:val="0"/>
-          <w:numId w:val="10"/>
-        </w:numPr>
-        <w:spacing w:before="0" w:after="60" w:line="283" w:lineRule="auto"/>
-      </w:pPr>
-      <w:r>
-        <w:rPr>
-          <w:rFonts w:ascii="Arial" w:hAnsi="Arial" w:cs="Arial"/>
-          <w:b w:val="0"/>
-          <w:i w:val="0"/>
-          <w:sz w:val="19"/>
-        </w:rPr>
-        <w:t>Nachweis über vorhandene Maschinen und Werkzeuge</w:t>
-      </w:r>
-    </w:p>
-    <w:p>
-      <w:pPr>
-        <w:numPr>
-          <w:ilvl w:val="0"/>
-          <w:numId w:val="10"/>
-        </w:numPr>
-        <w:spacing w:before="0" w:after="60" w:line="283" w:lineRule="auto"/>
-      </w:pPr>
-      <w:r>
-        <w:rPr>
-          <w:rFonts w:ascii="Arial" w:hAnsi="Arial" w:cs="Arial"/>
-          <w:b w:val="0"/>
-          <w:i w:val="0"/>
-          <w:sz w:val="19"/>
-        </w:rPr>
-        <w:t>Informationen zu Fördermöglichkeiten</w:t>
-      </w:r>
-    </w:p>
-    <w:p>
-      <w:pPr>
-        <w:numPr>
-          <w:ilvl w:val="0"/>
-          <w:numId w:val="10"/>
-        </w:numPr>
-        <w:spacing w:before="0" w:after="60" w:line="283" w:lineRule="auto"/>
-      </w:pPr>
-      <w:r>
-        <w:rPr>
-          <w:rFonts w:ascii="Arial" w:hAnsi="Arial" w:cs="Arial"/>
-          <w:b w:val="0"/>
-          <w:i w:val="0"/>
-          <w:sz w:val="19"/>
-        </w:rPr>
-        <w:t>Unterlagen zu Annas bestehendem Einkommen</w:t>
-      </w:r>
-    </w:p>
-    <w:p>
-      <w:pPr>
-        <w:numPr>
-          <w:ilvl w:val="0"/>
-          <w:numId w:val="10"/>
-        </w:numPr>
-        <w:spacing w:before="0" w:after="60" w:line="283" w:lineRule="auto"/>
-      </w:pPr>
-      <w:r>
-        <w:rPr>
-          <w:rFonts w:ascii="Arial" w:hAnsi="Arial" w:cs="Arial"/>
-          <w:b w:val="0"/>
-          <w:i w:val="0"/>
-          <w:sz w:val="19"/>
-        </w:rPr>
-        <w:t>Unterlagen zu Annas bestehender Selbstständigkeit im Backbereich</w:t>
-      </w:r>
-    </w:p>
-    <w:p>
-      <w:pPr>
-        <w:numPr>
-          <w:ilvl w:val="0"/>
-          <w:numId w:val="10"/>
-        </w:numPr>
-        <w:spacing w:before="0" w:after="60" w:line="283" w:lineRule="auto"/>
-      </w:pPr>
-      <w:r>
-        <w:rPr>
-          <w:rFonts w:ascii="Arial" w:hAnsi="Arial" w:cs="Arial"/>
-          <w:b w:val="0"/>
-          <w:i w:val="0"/>
-          <w:sz w:val="19"/>
-        </w:rPr>
-        <w:t>Liquiditätsplanung</w:t>
-      </w:r>
-    </w:p>
-    <w:p>
-      <w:pPr>
-        <w:numPr>
-          <w:ilvl w:val="0"/>
-          <w:numId w:val="10"/>
-        </w:numPr>
-        <w:spacing w:before="0" w:after="60" w:line="283" w:lineRule="auto"/>
-      </w:pPr>
-      <w:r>
-        <w:rPr>
-          <w:rFonts w:ascii="Arial" w:hAnsi="Arial" w:cs="Arial"/>
-          <w:b w:val="0"/>
-          <w:i w:val="0"/>
-          <w:sz w:val="19"/>
-        </w:rPr>
-        <w:t>Notfallstrategie bei geringerer Finanzierung</w:t>
       </w:r>
     </w:p>
     <w:p>

</xml_diff>